<commit_message>
fix(mobile-bar-en): entregables regenerados tras REVISION-FINAL (gates G1-G9 verdes, regresión) + REVISION-FINAL.md y F2-NOTAS §9
Via: Claude Code

Co-Authored-By: Claude Opus 5.5 <noreply@anthropic.com>
Claude-Session: https://claude.ai/code/session_015AJuJLbhFstHGHc1VA1PnR
</commit_message>
<xml_diff>
--- a/astro-site/public/dl/mobile-bar-business-plan/mobile-bar-business-plan.docx
+++ b/astro-site/public/dl/mobile-bar-business-plan/mobile-bar-business-plan.docx
@@ -315,17 +315,17 @@
     </w:p>
     <w:p>
       <w:r>
-        <w:t>Hosts in the United States hire mobile bars for three kinds of events: weddings, company parties and private celebrations. Search data shows the interest is real but niche. People look up "mobile bar business" about 480 times a month and "dry hire mobile bar" about 390 times (DataForSEO, October 2026), and most of those searches come from people thinking about starting one. We do not quote a market size, because no source we could open gives a reliable one. What matters is local: how many weddings, venues, offices and event planners sit within an hour or two of your storage unit. This plan describes a mobile bar company that serves all three groups without owning a bar or holding an alcohol inventory.</w:t>
+        <w:t>Hosts in the United States hire mobile bars for three kinds of events: weddings, corporate events and private celebrations. Search data shows the interest is real but niche. People look up "mobile bar business" about 480 times a month and "dry hire mobile bar" about 390 times (DataForSEO, October 2026), and many of those searches come from people thinking about starting one. We do not quote a market size, because no source we could open gives a reliable one. What matters is local: how many weddings, venues, offices and event planners sit within an hour or two of your storage unit. This plan describes a mobile bar company that serves all three groups without owning a bar or holding an alcohol inventory.</w:t>
       </w:r>
     </w:p>
     <w:p>
       <w:r>
-        <w:t>The concept is a mobile bar and bartending service sold as dry hire (you supply the alcohol; we bring the bar, the bartenders and everything else). We tow a converted bar trailer to the event, and a portable bar covers the second crew and ballrooms the trailer cannot enter. Our W-2 bartenders hold their state alcohol server certification and pour a short list of signature cocktails, with mixers, garnishes, ice and cups included. We handle setup and breakdown, and we send the host a shopping list so they buy the right amount of alcohol and nothing more. The owner's own pickup tows the trailer, so there is no vehicle on the startup list. What we sell is a bar that runs itself, not a drink.</w:t>
+        <w:t>The concept is a mobile bar and bartending service sold as dry hire (your client buys the alcohol; you bring the bar, the bartenders and everything else). We tow a converted bar trailer to the event, and a portable bar covers the second crew and ballrooms the trailer cannot enter. Our W-2 bartenders hold their state alcohol server certification and pour a short list of signature cocktails, with mixers, garnishes, ice and cups included. We handle setup and breakdown, and we send the host a shopping list so they buy the right amount of alcohol and nothing more. The owner's own pickup tows the trailer, so there is no vehicle on the startup list. What we sell is a bar that runs itself, not a drink.</w:t>
       </w:r>
     </w:p>
     <w:p>
       <w:r>
-        <w:t>The total startup investment is $76,972: $47,530 in startup costs plus $29,442 of working capital. The largest lines are the used bar trailer and its conversion, the wrap and bar facade, the portable bar, the glassware and coolers, and the website and photos that sell the first weddings. There is no alcohol inventory to finance, because the host buys it. The cash needed at opening is $76,972. We cover it with $28,000 of owner equity (36% of the total) and a $49,000 loan at 10.0% over 7 years, a size that fits within an SBA Microloan, which is capped at $50,000. Lenders still decide case by case, so treat the structure as a starting point for your own conversation.</w:t>
+        <w:t>The total startup investment is $76,972: $47,530 of capex plus $29,442 of working capital. The largest lines are the used bar trailer and its conversion, the wrap and bar facade, the portable bar, the glassware and coolers, and the website and photos that sell the first weddings. There is no alcohol inventory to finance, because the host buys it. The cash needed at opening is $76,972. We cover it with $28,000 of owner equity (36% of the total) and a $49,000 loan at 10.0% over 7 years, a size that fits within an SBA Microloan, which is capped at $50,000. Lenders still decide case by case, so treat the structure as a starting point for your own conversation.</w:t>
       </w:r>
     </w:p>
     <w:p>
@@ -409,12 +409,12 @@
     </w:p>
     <w:p>
       <w:r>
-        <w:t>Company events and private parties add weekday and winter volume. Companies book holiday parties in December, client receptions, team events and product launches, usually through an office manager or a planner who needs an invoice and a certificate of insurance. Private hosts book birthdays, anniversaries, graduations and retirement parties. The weekend still dominates: according to Check Cherry, about 85% of bookings fall between Friday and Sunday, and half of them on a Saturday. A company that books a Thursday evening is useful because it fills a night that would otherwise stay empty.</w:t>
+        <w:t>Corporate events and private parties add weekday and winter volume. Companies book holiday parties in December, client receptions, team events and product launches, usually through an office manager or a planner who needs an invoice and a certificate of insurance. Private hosts book birthdays, anniversaries, graduations and retirement parties. The weekend still dominates: according to Check Cherry, about 85% of bookings fall between Friday and Sunday, and half of them on a Saturday. A company that books a Thursday evening is useful because it fills a night that would otherwise stay empty.</w:t>
       </w:r>
     </w:p>
     <w:p>
       <w:r>
-        <w:t>The example case mixes the three groups. It assumes 60 weddings, 45 company events and 55 private parties, which is a kit estimate and not market data. Weddings are 37.5% of the events and about 48% of the sales, because they have more guests and run longer. The calendar is uneven, and the example opens in March, so Month 1 is March. Check Cherry puts October at about 13% of the year, May at 12.4% and January at 3.8%. Rotate the curve to your own opening month and replace the shares with what your first bookings suggest. Your local calendar will differ, especially in warm climates where winter is less quiet.</w:t>
+        <w:t>The example case mixes the three groups. It assumes 60 weddings, 45 corporate events and 55 private parties, which is a kit estimate and not market data. Weddings are 37.5% of the events and about 48% of the sales, because they have more guests and run longer. The calendar is uneven, and the example opens in March, so Month 1 is March. Check Cherry puts October at about 13% of the year, May at 12.4% and January at 3.8%. Rotate the curve to your own opening month and replace the shares with what your first bookings suggest. Your local calendar will differ, especially in warm climates where winter is less quiet.</w:t>
       </w:r>
     </w:p>
     <w:p>
@@ -503,7 +503,7 @@
     </w:p>
     <w:p>
       <w:r>
-        <w:t>Directories bring in qualified leads when a profile is complete. For weddings, The Knot, WeddingWire and Zola are where couples compare vendors, read reviews and send quote requests, so a full profile with photos and packages is worth the effort. GigSalad, The Bash and Thumbtack reach hosts for parties and company events, at the cost of a fee: the workbook models 5% on the 20% of sales that comes through them. We use marketplaces to find first-time clients and then invite the best ones to book direct next time.</w:t>
+        <w:t>Directories bring in qualified leads when a profile is complete. For weddings, The Knot, WeddingWire and Zola are where couples compare vendors, read reviews and send quote requests, so a full profile with photos and packages is worth the effort. GigSalad, The Bash and Thumbtack reach hosts for parties and corporate events, at the cost of a fee: the workbook models 5% on the 20% of sales that comes through them. We use marketplaces to find first-time clients and then invite the best ones to book direct next time.</w:t>
       </w:r>
     </w:p>
     <w:p>
@@ -513,7 +513,7 @@
     </w:p>
     <w:p>
       <w:r>
-        <w:t>Tastings and menu consultations are our closest step to the sale, so we budget for them as a line in the profit and loss statement. We offer them to serious prospects, mainly couples and larger company events, with two or three signature cocktails and a printed proposal. The proposal sets out the packages, the number of bartenders, the add-ons, the price per guest, the deposit and the cancellation terms. After the tasting we follow up within a day. Once the client accepts, we send the service agreement and collect the deposit to hold the date.</w:t>
+        <w:t>Tastings and menu consultations are our closest step to the sale, so we budget for them as a line in the profit and loss statement. We offer them to serious prospects, mainly couples and larger corporate events, with two or three signature cocktails and a printed proposal. The proposal sets out the packages, the number of bartenders, the add-ons, the price per guest, the deposit and the cancellation terms. After the tasting we follow up within a day. Once the client accepts, we send the service agreement and collect the deposit to hold the date.</w:t>
       </w:r>
     </w:p>
     <w:p>
@@ -545,12 +545,12 @@
     </w:p>
     <w:p>
       <w:r>
-        <w:t>Everything starts with the place where the bar lives between events. We do not rent a storefront or a production space. We rent a storage unit with parking for the trailer, budgeted at $600 per month in the example case. A drive-up unit of about 200 sq ft holds the trailer or, if you prefer to park it elsewhere, the portable bar, glass racks, coolers, ice bins, smallwares and spare mixers on shelving. Look for a unit with a power outlet, easy trailer access at any hour, good lighting and a gate you control, because loading happens early on Saturday mornings and late on Sunday nights. Glassware is washed in racks at the unit's wash station and counted out and back in at every event, so breakage is a number on the event sheet and not a surprise. Before paying a deposit, ask the facility whether it allows a trailer, whether it insures nothing inside the unit (most do not), and how much notice it needs to end the lease. Keep the rent in mind when you quote: it is a fixed cost that does not shrink in January.</w:t>
+        <w:t>Everything starts with the place where the bar lives between events. We do not rent a storefront or a production space. We rent a storage unit with parking for the trailer, budgeted at $600 per month in the example case. A drive-up unit of about 200 sq ft (19 sq m) holds the trailer or, if you prefer to park it elsewhere, the portable bar, glass racks, coolers, ice bins, smallwares and spare mixers on shelving. Look for a unit with a power outlet, easy trailer access at any hour, good lighting and a gate you control, because loading happens early on Saturday mornings and late on Sunday nights. Glassware is washed in racks at the unit's wash station and counted out and back in at every event, so breakage is a number on the event sheet and not a surprise. Before paying a deposit, ask the facility whether it allows a trailer, whether its insurance covers what you store inside (most do not, so list it on your equipment coverage), and how much notice it needs to end the lease. Keep the rent in mind when you quote: it is a fixed cost that does not shrink in January.</w:t>
       </w:r>
     </w:p>
     <w:p>
       <w:r>
-        <w:t>Own what travels and rent what does not. The core is one used bar trailer ($9,000) with its conversion ($12,000): a bar top, cabinets, a speed rail, ice bins, a hand sink, fresh and gray water tanks and LED lighting. The wrap and bar facade ($2,500) is what gets photographed, so it is money well spent. A portable bar ($2,000) serves the second crew and ballrooms the trailer cannot enter, an inverter generator ($1,800) keeps the lights and coolers running, and glassware, coolers and dispensers cost $3,500. Your own pickup is the tow vehicle. If you do not have one, a used pickup runs from $10k to $30k, according to Check Cherry, and that is a line you must add to the startup costs. Tables, linens, tents and extra glassware come from party rental companies and are passed through in the quote.</w:t>
+        <w:t>Own what travels and rent what does not. The core is one used bar trailer ($9,000) with its conversion ($12,000): a bar top, cabinets, a speed rail, ice bins, a hand sink, fresh and gray water tanks and LED lighting. The wrap and bar facade ($2,500) is what gets photographed, so it is money well spent. A portable bar ($2,000) serves the second crew and ballrooms the trailer cannot enter, an inverter generator ($1,800) keeps the lights and coolers running, and glassware, coolers and dispensers cost $3,500. Your own pickup is the tow vehicle. If you do not have one, a used pickup runs from $10,000 to $30,000, according to Check Cherry, and that is a line you must add to the startup costs. Tables, linens, tents and extra glassware come from party rental companies and are passed through in the quote.</w:t>
       </w:r>
     </w:p>
     <w:p>
@@ -565,7 +565,7 @@
     </w:p>
     <w:p>
       <w:r>
-        <w:t>We buy mixers, syrups and disposables from a short list of suppliers, with a backup for each, and we order garnish and ice the day before so nothing sits for a week. A fresh supply of lemons and limes is cheap; a missed delivery on a Saturday is not. Party rental companies supply tables, tents and extra glassware, and their delivery times are written into the event sheet. The trailer and the tow vehicle follow a calendar: tires, brakes, lights, bearings and the electrical system are checked every quarter and again before wedding season, with a monthly pre-trip checklist. Fuel, registration and repairs are in the budget, because a breakdown on a Saturday costs more than any rescue.</w:t>
+        <w:t>We buy mixers, syrups and disposables from a short list of suppliers, with a backup for each, and we order garnish and ice the day before so nothing sits for a week. A fresh supply of lemons and limes is cheap; a missed delivery on a Saturday is not. Party rental companies supply tables, tents and extra glassware, and their delivery times are written into the event sheet. The trailer and the tow vehicle follow a calendar: tires, brakes, lights, bearings and the electrical system are checked every quarter and again before wedding season, with a monthly pre-trip checklist. Fuel, registration and repairs are in the budget, because a breakdown on a Saturday costs more than any repair.</w:t>
       </w:r>
     </w:p>
     <w:p>
@@ -592,17 +592,17 @@
     </w:p>
     <w:p>
       <w:r>
-        <w:t>Labor costs $78,368 in year 1, including employer payroll taxes, which is 36.8% of sales. That figure covers the owner's pay, the part-time crew lead and the hourly event bartenders and barbacks the workbook schedules for the year-1 volume. Most of the cost moves with the calendar: no event, no shift. We keep the owner's pay inside the number so the plan shows the real cost of running the business. You can test any change in pay or headcount directly on the "Staffing" tab of the workbook.</w:t>
+        <w:t>Labor costs $78,368 in year 1, including employer payroll taxes, which is 36.8% of sales. That figure covers the owner's pay, the part-time crew lead and the hourly event bartenders and barbacks the workbook schedules for the year-1 volume. About a third of it, the hourly event bartenders and barbacks, moves with the calendar; your own pay and the crew lead's are fixed. We keep the owner's pay inside the number so the plan shows the real cost of running the business. You can test any change in pay or headcount directly on the "Staffing" tab of the workbook.</w:t>
       </w:r>
     </w:p>
     <w:p>
       <w:r>
-        <w:t>Event labor is the cost that moves with the calendar. Each event needs about 8.0 hours per person, counting prep, loading, travel, setup, service and breakdown, and an average of 2.2 people, so a heavy month costs more and a quiet one costs less. The workbook compares the hours scheduled with the hours needed and reports 131% coverage. As a Kit estimate, a full bar needs one bartender for every 50 guests, while a beer and wine bar stretches to one for every 75. We set staffing from the package we quote, never from habit, and we write the number of bartenders into the proposal.</w:t>
+        <w:t>Event labor is the cost that moves with the calendar. Each event needs about 8.0 hours per person, counting prep, loading, travel, setup, service and breakdown, and an average of 2.2 people. The workbook spreads payroll evenly over the 12 months, which is conservative: in a quiet month you will pay fewer event hours. The workbook compares the hours scheduled with the hours needed and reports 131% coverage. As a Kit estimate, a full bar needs one bartender for every 50 guests, while a beer and wine bar stretches to one for every 75. We set staffing from the package we quote, never from habit, and we write the number of bartenders into the proposal.</w:t>
       </w:r>
     </w:p>
     <w:p>
       <w:r>
-        <w:t>We hire event bartenders and barbacks as W-2 employees. They work under our direction, on our schedule, with our equipment, which is the profile the Fair Labor Standards Act treats as employment, and California's ABC test under AB5 presumes it. Calling them independent contractors may look cheaper, but misclassification can bring back taxes, penalties and claims, and it can sink a loan application. Payroll taxes add 10% to wages in the model, and workers' compensation is required in nearly every state. We pay at least the highest of the federal, state and local minimum wage; the workbook sets pay against a federal floor of $15,080 for full-time work, so check your city, as many are higher. For reference, the Bureau of Labor Statistics reports that bartenders earned a mean of $19.61 an hour and a median of $16.51 in May 2025, with tips included.</w:t>
+        <w:t>We hire event bartenders and barbacks as W-2 employees. They work under our direction, on our schedule, with our equipment, which is the profile the Fair Labor Standards Act treats as employment, and California's "ABC test" for employment status (AB5) presumes it. Calling them independent contractors may look cheaper, but misclassification can bring back taxes, penalties and claims, and it can sink a loan application. Payroll taxes add 10% to wages in the model, and workers' compensation is required in nearly every state. We pay at least the highest of the federal, state and local minimum wage; the workbook sets pay against a federal floor of $15,080 for full-time work, so check your city, as many are higher. For reference, the Bureau of Labor Statistics reports that bartenders earned a mean of $19.61 an hour and a median of $16.51 in May 2025, with tips included.</w:t>
       </w:r>
     </w:p>
     <w:p>
@@ -612,7 +612,7 @@
     </w:p>
     <w:p>
       <w:r>
-        <w:t>Treat the service charge and the gratuity as two different things, because the IRS does. Under IRS Revenue Ruling 2012-18, a mandatory service charge is not a tip: whatever part you pay out to staff is wages, with payroll taxes. A tip is voluntary, and under the FLSA it belongs to the staff, not to the owner. We show the service charge and any voluntary gratuity on separate lines of the quote and say what each pays for. A tip jar needs one more check. In Missouri, for example, tips collected at a dry hire event can be treated as a sale of alcohol, so use a jar only where your state allows it, and put the agreed gratuity in the contract instead.</w:t>
+        <w:t>Treat the service charge and the gratuity as two different things, because the IRS does. Under IRS Revenue Ruling 2012-18, a mandatory service charge is not a tip: whatever part you pay out to staff is wages, with payroll taxes. A tip is voluntary, and under the FLSA it belongs to the staff, not to the owner. We show the service charge and any voluntary gratuity on separate lines of the quote and say what each pays for. Tips need one more check. Missouri's circular lists tips, gratuities and donations among the payments that can count as a sale of alcohol, so ask your state ABC before you put out a tip jar or add a gratuity line; where in doubt, build the staff's pay into your service price.</w:t>
       </w:r>
     </w:p>
     <w:p>
@@ -644,7 +644,7 @@
     </w:p>
     <w:p>
       <w:r>
-        <w:t>Revenue grows with the number of events, not with price. The example moves from $212,800 in year 1 to $234,080 in year 2 and $252,806 in year 3, because events per year grow by 10% and 8% while the price per guest and the guest count stay the same. Net profit follows at $18,790, $28,076 and $36,062, after loan interest, depreciation and income tax at an effective rate of 25%.</w:t>
+        <w:t>Revenue grows with the number of events, not with price. The example moves from $212,800 in year 1 to $234,080 in year 2 and $252,806 in year 3, because events per year grow by 10% and 8% while the price per guest and the guest count stay the same. Net profit follows at $18,790, $28,076 and $36,062, after loan interest, depreciation and income tax at an effective rate of 25%. That rate stands in for the income tax on the profit; if your LLC is a pass-through, the owner pays it personally, so keep the reserve anyway.</w:t>
       </w:r>
     </w:p>
     <w:p>
@@ -654,7 +654,7 @@
     </w:p>
     <w:p>
       <w:r>
-        <w:t>Break-even is measured in events per year. The business covers its accounting costs at 134 events and its cash costs at 133 events, against 160 in the plan. The plan sits 21% above cash break-even, so events could fall by about 17% before cash stops covering costs. Compare that with the market: the typical new mobile bar does far fewer.</w:t>
+        <w:t>Break-even is measured in events per year. The business covers its accounting costs at 134 events and its cash costs at 133 events, against 160 in the plan (the workbook shows the exact figure; the plan rounds it up to whole events). The plan sits 21% above cash break-even, so events could fall by about 17% before cash stops covering costs. Compare that with the market: the typical new mobile bar does far fewer.</w:t>
       </w:r>
     </w:p>
     <w:p>
@@ -686,17 +686,17 @@
     </w:p>
     <w:p>
       <w:r>
-        <w:t>Dry hire is the legal model of this kit: the host buys the alcohol, and we sell the service. Missouri's Industry Circular 24-01 (atc.dps.mo.gov) says a person who solely provides bartending services does not need a state liquor license, and warns that admission, tips, gratuities, donations and surcharges on alcohol can count as a sale. The conditions are simple. The host buys and owns the alcohol, and leftovers go back to the host. If you buy it, you act only as their agent, authorized in writing, at cost with receipts and no markup. There is no cash bar, no drink tickets and no ticket that includes drinks. The invoice separates your service from any reimbursements.</w:t>
+        <w:t>Dry hire is the legal model of this kit: the host buys the alcohol, and we sell the service. Missouri's Industry Circular 24-01 (atc.dps.mo.gov) says a person who solely provides bartending services does not need a state liquor license, and warns that admission, tips, gratuities, donations and surcharges on alcohol can count as a sale. The conditions are simple. The host buys and owns the alcohol, and leftovers go back to the host. Do not buy the alcohol for the host and get paid back: in Missouri, money for alcohol or its delivery can count as a sale, and Montana requires the host to buy it separately. There is no cash bar, no drink tickets and no ticket that includes drinks. The invoice separates your service from any reimbursements.</w:t>
       </w:r>
     </w:p>
     <w:p>
       <w:r>
-        <w:t>Montana's Department of Revenue, in its Mobile Bars fact sheet, goes further: a mobile bar may not pre-stock, the host buys the alcohol separately, the events must be private, and guests cannot be charged for drinks. Other states have their own versions, and the rule is always the same: it varies by state. Before you take your first booking, ask your state alcohol authority (the ABC, TABC or its equivalent) how it treats a bartending service, and keep the answer in writing. A phone call or an email is enough, and it can save you a fine.</w:t>
+        <w:t>Montana's Department of Revenue, in its Mobile Bars fact sheet, goes further: a mobile bar may not pre-stock, the host buys the alcohol separately, the events must be private, and guests cannot be charged for drinks. Other states have their own versions, and the only constant is that it varies by state. Before you take your first booking, ask your state alcohol authority (the ABC, TABC or its equivalent) how it treats a bartending service, and keep the answer in writing. A phone call or an email is enough, and it can save you a fine.</w:t>
       </w:r>
     </w:p>
     <w:p>
       <w:r>
-        <w:t>Full-service, where you supply the alcohol, is an option, not the case of this kit, and it varies by state. In Texas, a Caterer's Permit is an auxiliary to a Mixed Beverage Permit tied to a fixed address. In California, a private event with no admission, no charge per drink and the host's alcohol needs no license, and the Type 58 caterer license is for on-sale licensees. In Florida, selling without a license is a crime, so a cash bar needs a licensed partner (a 13CT caterer). In New York, a Caterer's Alcohol Permit from the SLA is issued per event, so check with the SLA first. The routes are a licensed partner, your own license tied to a venue, or an event permit where one exists.</w:t>
+        <w:t>Full-service, where your business buys and sells the alcohol, is an option, not the case of this kit, and it varies by state. In Texas, a Caterer's Permit is an auxiliary to a Mixed Beverage Permit tied to a fixed address. In California, a private event with no admission, no charge per drink and the host's alcohol generally needs no state license (Bus. &amp; Prof. Code §23399.1; confirm with the ABC), and the Type 58 caterer license is for on-sale licensees. In Florida, selling without a license is a crime, so a cash bar needs a licensed partner (a 13CT caterer). In New York, a Caterer's Alcohol Permit from the SLA is issued per event, so check with the SLA first. The routes are a licensed partner, your own license tied to a venue, or an event permit where one exists.</w:t>
       </w:r>
     </w:p>
     <w:p>
@@ -706,17 +706,17 @@
     </w:p>
     <w:p>
       <w:r>
-        <w:t>Sales tax can reach the service. California taxes a caterer's service charges even when the caterer provides no meals or drinks (CDTFA), so a bar service is taxable there. Elsewhere it depends on whether your state taxes the service, the bar rental and the glassware. The workbook applies 8% to the whole invoice, the conservative choice. Register for a sales tax permit with your state. A mandatory service charge is wages under IRS Revenue Ruling 2012-18, and a voluntary gratuity goes on its own line and belongs to the staff.</w:t>
+        <w:t>Sales tax can reach the service. California taxes a caterer's charges for serving meals or drinks, even when the client supplies them (CDTFA), so bartending charges are generally taxable there. Elsewhere it depends on whether your state taxes the service, the bar rental and the glassware. The workbook applies 8% to the whole invoice, the conservative choice. Register for a sales tax permit with your state. A mandatory service charge is wages under IRS Revenue Ruling 2012-18, and a voluntary gratuity goes on its own line and belongs to the staff.</w:t>
       </w:r>
     </w:p>
     <w:p>
       <w:r>
-        <w:t>On insurance, plan for general liability and a separate liquor liability policy, because general liability usually excludes alcohol; for a mobile bartender, liquor liability starts around $550 a year, according to insurancecanopy.com. Add commercial auto that covers the trailer, workers' compensation and equipment coverage. The example budgets $4,000 per year. Venues ask for a COI naming them as additional insured, and the host's own liquor liability is the host's purchase. Staff are W-2 employees, with Form I-9, Form W-4, workers' compensation and the FLSA applying to tips; California's AB5 presumes employment. In Texas, certified bartenders give you the safe harbor under section 106.14.</w:t>
+        <w:t>On insurance, plan for general liability and a separate liquor liability policy, because general liability usually excludes alcohol; for a mobile bartender, general and liquor liability, bundled, start around $550 a year, according to insurancecanopy.com. Add commercial auto that covers the trailer, workers' compensation and equipment coverage. The example budgets $4,000 per year. Venues ask for a COI naming them as additional insured, and the host's own liquor liability is the host's purchase. Staff are W-2 employees, with Form I-9, Form W-4, workers' compensation and the FLSA applying to tips; California's AB5 presumes employment. In Texas, certified bartenders give you the safe harbor under section 106.14.</w:t>
       </w:r>
     </w:p>
     <w:p>
       <w:r>
-        <w:t>The trailer is titled and registered with your state DMV and needs commercial auto insurance, and some states require a separate registration for the trailer, so ask your DMV. If you operate in the UK, the rules differ. Every sale at a venue with a premises licence must be authorized by a personal licence holder (18 or over, APLH Level 2, granted by the council), but you do not need one to sell under a Temporary Event Notice. A TEN costs £21, covers fewer than 500 people for up to 168 hours, and you can give 5 a year, or 50 with a personal licence, at least 10 working days ahead (gov.uk). At a licensed venue you work under the venue's licence, and a ticket that includes drinks counts as a sale.</w:t>
+        <w:t>The trailer gets its own title, registration and plates at your state DMV (rules for light trailers vary, so ask), and your auto policy must cover business use. If you operate in the UK, the rules differ. Every sale at a venue with a premises licence must be authorized by a personal licence holder (18 or over, APLH Level 2, granted by the council), but you do not need one to sell under a Temporary Event Notice. A TEN costs £21, covers fewer than 500 people for up to 168 hours, and you can give 5 a year, or 50 with a personal licence, at least 10 working days ahead (gov.uk). At a licensed venue you work under the venue's licence, and a ticket that includes drinks counts as a sale.</w:t>
       </w:r>
     </w:p>
     <w:p>
@@ -738,12 +738,12 @@
     </w:p>
     <w:p>
       <w:r>
-        <w:t>The plan holds together because of how it is built. In dry hire there is no alcohol inventory to carry and no liquor license to buy, so the capital stays low and the risk stays bounded. Two demand engines balance each other: weddings fill the weekends of peak season, and companies and private hosts fill the weekdays and the winter. The bar trailer gives the brand something to be photographed and remembered for, and the specialty bars give planners a reason to recommend it. One caution, honestly: the example is the upper quarter of the market. A new mobile bar usually starts with far fewer events, so build the first year on your own bookings, not on the case.</w:t>
+        <w:t>The plan holds together because of how it is built. In dry hire there is no alcohol inventory to carry and, in most states, no liquor license to buy, so the capital stays low and the risk stays bounded. Two demand engines balance each other: weddings fill the weekends of peak season, and companies and private hosts fill the weekdays and the winter. The bar trailer gives the brand something to be photographed and remembered for, and the specialty bars give planners a reason to recommend it. One caution, honestly: the example is the upper quarter of the market. A new mobile bar usually starts with far fewer events, so build the first year on your own bookings, not on the case.</w:t>
       </w:r>
     </w:p>
     <w:p>
       <w:r>
-        <w:t>Know the risks before you sign anything. Late cancellations are handled by a 30% deposit at signing and a written cancellation schedule, and no date is held without both. An intoxicated or underage guest is handled by certified bartenders, responsible service rules and liquor liability coverage. A breakdown of the trailer or the tow vehicle is covered by maintenance, a portable bar as backup and a relationship with a local rental company. Rain at an outdoor event is handled by a written plan B and a tent partner. Broken glass is counted and charged by the contract. A shortage of bartenders on a Saturday is handled by a bench of trained W-2 staff. A change in state alcohol rules is handled by asking your ABC each year.</w:t>
+        <w:t>Know the risks before you sign anything. Late cancellations are handled by a 30% deposit at signing and a written cancellation schedule, and no date is held without both. An intoxicated or underage guest is handled by certified bartenders, responsible service rules and liquor liability coverage. A breakdown of the trailer or the tow vehicle is covered by maintenance, a portable bar as backup and a relationship with a local rental company. Rain at an outdoor event is handled by a written plan B and a tent rental company. Broken glass is counted and charged by the contract. A shortage of bartenders on a Saturday is handled by a bench of trained W-2 staff. A change in state alcohol rules is handled by asking your ABC each year.</w:t>
       </w:r>
     </w:p>
     <w:p>

</xml_diff>